<commit_message>
docs: replace speech with Dajana's improved, more natural wording (removed coaching notes, kept 15:00 total timing)
</commit_message>
<xml_diff>
--- a/docs/govor-za-odbranu.docx
+++ b/docs/govor-za-odbranu.docx
@@ -41,23 +41,10 @@
         <w:t>Укупно циљано трајање излагања: ~15 минута (900 секунди)  ·  16 слајдова</w:t>
       </w:r>
     </w:p>
-    <w:p>
-      <w:pPr>
-        <w:jc w:val="center"/>
-      </w:pPr>
-      <w:r>
-        <w:rPr>
-          <w:i/>
-          <w:color w:val="5A6370"/>
-          <w:sz w:val="20"/>
-        </w:rPr>
-        <w:t>Прочитај овај текст неколико пута унапред — на самој одбрани немој да читаш дословно, него причај својим речима, ослањајући се на кључне тачке.</w:t>
-      </w:r>
-    </w:p>
     <w:p/>
     <w:p>
       <w:pPr>
-        <w:spacing w:before="360" w:after="40"/>
+        <w:spacing w:before="320" w:after="40"/>
       </w:pPr>
       <w:r>
         <w:rPr>
@@ -65,7 +52,7 @@
           <w:color w:val="141E2E"/>
           <w:sz w:val="28"/>
         </w:rPr>
-        <w:t>СЛАЈД 1  —  Насловни слајд</w:t>
+        <w:t>СЛАЈД 1 — Насловни слајд</w:t>
       </w:r>
     </w:p>
     <w:p>
@@ -74,7 +61,6 @@
       </w:pPr>
       <w:r>
         <w:rPr>
-          <w:b/>
           <w:color w:val="2C8C82"/>
           <w:sz w:val="20"/>
         </w:rPr>
@@ -90,82 +76,12 @@
         <w:rPr>
           <w:sz w:val="23"/>
         </w:rPr>
-        <w:t>Добро дан/вече, поштована комисијо. Ја сам Дајана Булић, а тема мог завршног рада је „Имплементација обсервабилности микросервисне архитектуре, на примеру TravelPlanner апликације”, под менторством др Себастијана Стоје.</w:t>
+        <w:t>Добар дан/вече, поштована комисијо. Ја сам Дајана Булић, а тема мог завршног рада је „Имплементација обсервабилности микросервисне архитектуре на примеру TravelPlanner апликације“, под менторством др Себастијана Стоје.</w:t>
       </w:r>
     </w:p>
     <w:p>
       <w:pPr>
-        <w:spacing w:after="40"/>
-      </w:pPr>
-      <w:r>
-        <w:rPr>
-          <w:b/>
-          <w:color w:val="B02A2A"/>
-          <w:sz w:val="21"/>
-        </w:rPr>
-        <w:t>Не заборави:</w:t>
-      </w:r>
-    </w:p>
-    <w:p>
-      <w:pPr>
-        <w:pStyle w:val="ListBullet"/>
-        <w:spacing w:after="40"/>
-      </w:pPr>
-      <w:r>
-        <w:rPr>
-          <w:color w:val="5A6370"/>
-          <w:sz w:val="21"/>
-        </w:rPr>
-        <w:t>Изговорити пун наслов рада тачно.</w:t>
-      </w:r>
-    </w:p>
-    <w:p>
-      <w:pPr>
-        <w:pStyle w:val="ListBullet"/>
-        <w:spacing w:after="40"/>
-      </w:pPr>
-      <w:r>
-        <w:rPr>
-          <w:color w:val="5A6370"/>
-          <w:sz w:val="21"/>
-        </w:rPr>
-        <w:t>Кратко, самоуверено — ово је само 20 секунди.</w:t>
-      </w:r>
-    </w:p>
-    <w:p>
-      <w:pPr>
-        <w:spacing w:after="80"/>
-      </w:pPr>
-      <w:r>
-        <w:rPr>
-          <w:b/>
-          <w:i/>
-          <w:color w:val="2C8C82"/>
-          <w:sz w:val="21"/>
-        </w:rPr>
-        <w:t xml:space="preserve">Прелаз: </w:t>
-      </w:r>
-      <w:r>
-        <w:rPr>
-          <w:i/>
-          <w:color w:val="5A6370"/>
-          <w:sz w:val="21"/>
-        </w:rPr>
-        <w:t>Прелазим одмах на то шта је Travel Planner и зашто сам изабрала баш њега.</w:t>
-      </w:r>
-    </w:p>
-    <w:p>
-      <w:r>
-        <w:rPr>
-          <w:color w:val="D0D4DA"/>
-          <w:sz w:val="16"/>
-        </w:rPr>
-        <w:t>──────────────────────────────────────────────────────────────────────────────────────────</w:t>
-      </w:r>
-    </w:p>
-    <w:p>
-      <w:pPr>
-        <w:spacing w:before="360" w:after="40"/>
+        <w:spacing w:before="320" w:after="40"/>
       </w:pPr>
       <w:r>
         <w:rPr>
@@ -173,7 +89,7 @@
           <w:color w:val="141E2E"/>
           <w:sz w:val="28"/>
         </w:rPr>
-        <w:t>СЛАЈД 2  —  Travel Planner — постојећа апликација</w:t>
+        <w:t>СЛАЈД 2 — Travel Planner — постојећа апликација</w:t>
       </w:r>
     </w:p>
     <w:p>
@@ -182,7 +98,6 @@
       </w:pPr>
       <w:r>
         <w:rPr>
-          <w:b/>
           <w:color w:val="2C8C82"/>
           <w:sz w:val="20"/>
         </w:rPr>
@@ -198,82 +113,24 @@
         <w:rPr>
           <w:sz w:val="23"/>
         </w:rPr>
-        <w:t>Travel Planner је постојећа микросервисна веб апликација за планирање путовања. Корисник на једном месту организује цео план путовања — дестинације, дневне активности кроз календар, трошкове и буџет, checklist, подсетнике, а план може да подели са другим особама путем кода или QR кода. Систем је реализован кроз четири одвојена сервиса на Microsoft Service Fabric платформи: Gateway, AuthService, TripService и SharingService.</w:t>
+        <w:t>Travel Planner је постојећа микросервисна веб апликација за планирање путовања. Корисник на једном месту може да организује цео план путовања — дестинације, дневне активности кроз календар, трошкове и буџет, checklist и подсетнике. План може да подели и са другим особама путем кода или QR кода.</w:t>
       </w:r>
     </w:p>
     <w:p>
       <w:pPr>
-        <w:spacing w:after="40"/>
+        <w:spacing w:after="120"/>
+        <w:jc w:val="both"/>
       </w:pPr>
       <w:r>
         <w:rPr>
-          <w:b/>
-          <w:color w:val="B02A2A"/>
-          <w:sz w:val="21"/>
+          <w:sz w:val="23"/>
         </w:rPr>
-        <w:t>Не заборави:</w:t>
+        <w:t>Систем је реализован кроз четири одвојена сервиса на Microsoft Service Fabric платформи: Gateway, AuthService, TripService и SharingService.</w:t>
       </w:r>
     </w:p>
     <w:p>
       <w:pPr>
-        <w:pStyle w:val="ListBullet"/>
-        <w:spacing w:after="40"/>
-      </w:pPr>
-      <w:r>
-        <w:rPr>
-          <w:color w:val="5A6370"/>
-          <w:sz w:val="21"/>
-        </w:rPr>
-        <w:t>Ово је ПОСТОЈЕЋИ систем — не нешто што сам ја градила од нуле.</w:t>
-      </w:r>
-    </w:p>
-    <w:p>
-      <w:pPr>
-        <w:pStyle w:val="ListBullet"/>
-        <w:spacing w:after="40"/>
-      </w:pPr>
-      <w:r>
-        <w:rPr>
-          <w:color w:val="5A6370"/>
-          <w:sz w:val="21"/>
-        </w:rPr>
-        <w:t>Спомени да ће архитектура детаљно доћи за пар слајдова, сад је само упознавање.</w:t>
-      </w:r>
-    </w:p>
-    <w:p>
-      <w:pPr>
-        <w:spacing w:after="80"/>
-      </w:pPr>
-      <w:r>
-        <w:rPr>
-          <w:b/>
-          <w:i/>
-          <w:color w:val="2C8C82"/>
-          <w:sz w:val="21"/>
-        </w:rPr>
-        <w:t xml:space="preserve">Прелаз: </w:t>
-      </w:r>
-      <w:r>
-        <w:rPr>
-          <w:i/>
-          <w:color w:val="5A6370"/>
-          <w:sz w:val="21"/>
-        </w:rPr>
-        <w:t>Али чим систем има више сервиса, јавља се један озбиљан проблем — а о томе следећи слајд.</w:t>
-      </w:r>
-    </w:p>
-    <w:p>
-      <w:r>
-        <w:rPr>
-          <w:color w:val="D0D4DA"/>
-          <w:sz w:val="16"/>
-        </w:rPr>
-        <w:t>──────────────────────────────────────────────────────────────────────────────────────────</w:t>
-      </w:r>
-    </w:p>
-    <w:p>
-      <w:pPr>
-        <w:spacing w:before="360" w:after="40"/>
+        <w:spacing w:before="320" w:after="40"/>
       </w:pPr>
       <w:r>
         <w:rPr>
@@ -281,7 +138,7 @@
           <w:color w:val="141E2E"/>
           <w:sz w:val="28"/>
         </w:rPr>
-        <w:t>СЛАЈД 3  —  Микросервиси су тешки за праћење</w:t>
+        <w:t>СЛАЈД 3 — Микросервиси су тешки за праћење</w:t>
       </w:r>
     </w:p>
     <w:p>
@@ -290,7 +147,6 @@
       </w:pPr>
       <w:r>
         <w:rPr>
-          <w:b/>
           <w:color w:val="2C8C82"/>
           <w:sz w:val="20"/>
         </w:rPr>
@@ -306,82 +162,36 @@
         <w:rPr>
           <w:sz w:val="23"/>
         </w:rPr>
-        <w:t>Микросервисна архитектура доноси познате предности — независно скалирање, одвојен развој по сервису. Али доноси и озбиљан проблем: један кориснички захтев данас пролази кроз више процеса, база и мрежних позива. Кад нешто крене наопако, питања попут „зашто је овај захтев спор“, „где тачно долази до грешке“ или „да ли је систем тренутно здрав“ постају знатно теже него код монолитне апликације, где је довољно погледати један логфајл.</w:t>
+        <w:t>Микросервисна архитектура има предности као што су независно скалирање и одвојен развој сервиса. Међутим, доноси и један озбиљан проблем: један кориснички захтев може да прође кроз више процеса, база и мрежних позива.</w:t>
       </w:r>
     </w:p>
     <w:p>
       <w:pPr>
-        <w:spacing w:after="40"/>
+        <w:spacing w:after="120"/>
+        <w:jc w:val="both"/>
       </w:pPr>
       <w:r>
         <w:rPr>
-          <w:b/>
-          <w:color w:val="B02A2A"/>
-          <w:sz w:val="21"/>
+          <w:sz w:val="23"/>
         </w:rPr>
-        <w:t>Не заборави:</w:t>
+        <w:t>Када нешто пође наопако, питања као што су „зашто је овај захтев спор“, „где тачно долази до грешке“ или „да ли је систем тренутно здрав“ постају много тежа.</w:t>
       </w:r>
     </w:p>
     <w:p>
       <w:pPr>
-        <w:pStyle w:val="ListBullet"/>
-        <w:spacing w:after="40"/>
+        <w:spacing w:after="120"/>
+        <w:jc w:val="both"/>
       </w:pPr>
       <w:r>
         <w:rPr>
-          <w:color w:val="5A6370"/>
-          <w:sz w:val="21"/>
+          <w:sz w:val="23"/>
         </w:rPr>
-        <w:t>Нагласи да су ово БАШ она питања на која постојећи Travel Planner NIJE могао да одговори.</w:t>
+        <w:t>Управо на та питања постојећи Travel Planner није могао да да одговор.</w:t>
       </w:r>
     </w:p>
     <w:p>
       <w:pPr>
-        <w:pStyle w:val="ListBullet"/>
-        <w:spacing w:after="40"/>
-      </w:pPr>
-      <w:r>
-        <w:rPr>
-          <w:color w:val="5A6370"/>
-          <w:sz w:val="21"/>
-        </w:rPr>
-        <w:t>Ово је емотивно/мотивационо језгро рада — не журити овде.</w:t>
-      </w:r>
-    </w:p>
-    <w:p>
-      <w:pPr>
-        <w:spacing w:after="80"/>
-      </w:pPr>
-      <w:r>
-        <w:rPr>
-          <w:b/>
-          <w:i/>
-          <w:color w:val="2C8C82"/>
-          <w:sz w:val="21"/>
-        </w:rPr>
-        <w:t xml:space="preserve">Прелаз: </w:t>
-      </w:r>
-      <w:r>
-        <w:rPr>
-          <w:i/>
-          <w:color w:val="5A6370"/>
-          <w:sz w:val="21"/>
-        </w:rPr>
-        <w:t>Управо то је разлог зашто сам поставила циљ рада овако.</w:t>
-      </w:r>
-    </w:p>
-    <w:p>
-      <w:r>
-        <w:rPr>
-          <w:color w:val="D0D4DA"/>
-          <w:sz w:val="16"/>
-        </w:rPr>
-        <w:t>──────────────────────────────────────────────────────────────────────────────────────────</w:t>
-      </w:r>
-    </w:p>
-    <w:p>
-      <w:pPr>
-        <w:spacing w:before="360" w:after="40"/>
+        <w:spacing w:before="320" w:after="40"/>
       </w:pPr>
       <w:r>
         <w:rPr>
@@ -389,7 +199,7 @@
           <w:color w:val="141E2E"/>
           <w:sz w:val="28"/>
         </w:rPr>
-        <w:t>СЛАЈД 4  —  Циљ рада</w:t>
+        <w:t>СЛАЈД 4 — Циљ рада</w:t>
       </w:r>
     </w:p>
     <w:p>
@@ -398,7 +208,6 @@
       </w:pPr>
       <w:r>
         <w:rPr>
-          <w:b/>
           <w:color w:val="2C8C82"/>
           <w:sz w:val="20"/>
         </w:rPr>
@@ -414,69 +223,36 @@
         <w:rPr>
           <w:sz w:val="23"/>
         </w:rPr>
-        <w:t>Циљ рада је био четворострук: прво, анализирати постојећи систем са аспекта обсервабилности и идентификовати конкретне недостатке. Друго, надоградити систем слојем обсервабилности заснованим на индустријском стандарду OpenTelemetry. Треће — и ово ми је било важно — не дирати постојећу пословну логику, планове и трошкове. И четврто, доказати да надоградња стварно ради кроз извршавање, аутоматизоване тестове и мерљиве резултате, а не само кроз инсталацију алата.</w:t>
+        <w:t>Циљ рада био је да се, пре свега, анализира постојећи систем са аспекта обсервабилности и идентификују конкретни недостаци.</w:t>
       </w:r>
     </w:p>
     <w:p>
       <w:pPr>
-        <w:spacing w:after="40"/>
+        <w:spacing w:after="120"/>
+        <w:jc w:val="both"/>
       </w:pPr>
       <w:r>
         <w:rPr>
-          <w:b/>
-          <w:color w:val="B02A2A"/>
-          <w:sz w:val="21"/>
+          <w:sz w:val="23"/>
         </w:rPr>
-        <w:t>Не заборави:</w:t>
+        <w:t>Након тога, циљ је био да се систем надогради слојем обсервабилности заснованим на OpenTelemetry стандарду. При томе је било важно да се не мења постојећа пословна логика.</w:t>
       </w:r>
     </w:p>
     <w:p>
       <w:pPr>
-        <w:pStyle w:val="ListBullet"/>
-        <w:spacing w:after="40"/>
+        <w:spacing w:after="120"/>
+        <w:jc w:val="both"/>
       </w:pPr>
       <w:r>
         <w:rPr>
-          <w:color w:val="5A6370"/>
-          <w:sz w:val="21"/>
+          <w:sz w:val="23"/>
         </w:rPr>
-        <w:t>Нагласи реч „доказати” — то је нит целог рада и враћа се на крају.</w:t>
+        <w:t>На крају, било је потребно и доказати да надоградња заиста функционише — кроз извршавање система, аутоматизоване тестове и мерљиве резултате, а не само кроз инсталацију алата.</w:t>
       </w:r>
     </w:p>
     <w:p>
       <w:pPr>
-        <w:spacing w:after="80"/>
-      </w:pPr>
-      <w:r>
-        <w:rPr>
-          <w:b/>
-          <w:i/>
-          <w:color w:val="2C8C82"/>
-          <w:sz w:val="21"/>
-        </w:rPr>
-        <w:t xml:space="preserve">Прелаз: </w:t>
-      </w:r>
-      <w:r>
-        <w:rPr>
-          <w:i/>
-          <w:color w:val="5A6370"/>
-          <w:sz w:val="21"/>
-        </w:rPr>
-        <w:t>Да бих то урадила, прво сам морала детаљно да анализирам постојеће стање.</w:t>
-      </w:r>
-    </w:p>
-    <w:p>
-      <w:r>
-        <w:rPr>
-          <w:color w:val="D0D4DA"/>
-          <w:sz w:val="16"/>
-        </w:rPr>
-        <w:t>──────────────────────────────────────────────────────────────────────────────────────────</w:t>
-      </w:r>
-    </w:p>
-    <w:p>
-      <w:pPr>
-        <w:spacing w:before="360" w:after="40"/>
+        <w:spacing w:before="320" w:after="40"/>
       </w:pPr>
       <w:r>
         <w:rPr>
@@ -484,7 +260,7 @@
           <w:color w:val="141E2E"/>
           <w:sz w:val="28"/>
         </w:rPr>
-        <w:t>СЛАЈД 5  —  Архитектура пре надоградње (AS-IS)</w:t>
+        <w:t>СЛАЈД 5 — Архитектура пре надоградње (AS-IS)</w:t>
       </w:r>
     </w:p>
     <w:p>
@@ -493,7 +269,6 @@
       </w:pPr>
       <w:r>
         <w:rPr>
-          <w:b/>
           <w:color w:val="2C8C82"/>
           <w:sz w:val="20"/>
         </w:rPr>
@@ -509,82 +284,48 @@
         <w:rPr>
           <w:sz w:val="23"/>
         </w:rPr>
-        <w:t>Ево архитектуре система пре надоградње. Три сервиса — Gateway, AuthService и TripService — су stateless, што значи да не чувају стање између позива, све се ослања на базу. SharingService је једини stateful сервис, зато што важећи кодови за дељење морају да буду доступни са ниском латенцијом, па се кеширају директно на Service Fabric чвору кроз Reliable Collections. Свака компонента има своју базу, по принципу database-per-service.</w:t>
+        <w:t>Овде је приказана архитектура система пре надоградње.</w:t>
       </w:r>
     </w:p>
     <w:p>
       <w:pPr>
-        <w:spacing w:after="40"/>
+        <w:spacing w:after="120"/>
+        <w:jc w:val="both"/>
       </w:pPr>
       <w:r>
         <w:rPr>
-          <w:b/>
-          <w:color w:val="B02A2A"/>
-          <w:sz w:val="21"/>
+          <w:sz w:val="23"/>
         </w:rPr>
-        <w:t>Не заборави:</w:t>
+        <w:t>Gateway, AuthService и TripService су stateless сервиси, што значи да не чувају стање између позива и ослањају се на своје базе. SharingService је stateful зато што се важећи кодови за дељење кеширају на Service Fabric чвору кроз Reliable Collections, како би били доступни са ниском латенцијом.</w:t>
       </w:r>
     </w:p>
     <w:p>
       <w:pPr>
-        <w:pStyle w:val="ListBullet"/>
-        <w:spacing w:after="40"/>
+        <w:spacing w:after="120"/>
+        <w:jc w:val="both"/>
       </w:pPr>
       <w:r>
         <w:rPr>
-          <w:color w:val="5A6370"/>
-          <w:sz w:val="21"/>
+          <w:sz w:val="23"/>
         </w:rPr>
-        <w:t>Не мораш да читаш сваку кутију — покажи руком general flow: Frontend → Gateway → сервиси → базе.</w:t>
+        <w:t>Свака компонента има своју базу, по принципу database-per-service.</w:t>
       </w:r>
     </w:p>
     <w:p>
       <w:pPr>
-        <w:pStyle w:val="ListBullet"/>
-        <w:spacing w:after="40"/>
+        <w:spacing w:after="120"/>
+        <w:jc w:val="both"/>
       </w:pPr>
       <w:r>
         <w:rPr>
-          <w:color w:val="5A6370"/>
-          <w:sz w:val="21"/>
+          <w:sz w:val="23"/>
         </w:rPr>
-        <w:t>Кључна реченица: „SharingService је stateful ЗАТО ШТО...” — то показује да разумеш архитектуру, не само да си је нацртала.</w:t>
+        <w:t>На дијаграму је најважнији основни ток: Frontend → Gateway → остали сервиси → базе.</w:t>
       </w:r>
     </w:p>
     <w:p>
       <w:pPr>
-        <w:spacing w:after="80"/>
-      </w:pPr>
-      <w:r>
-        <w:rPr>
-          <w:b/>
-          <w:i/>
-          <w:color w:val="2C8C82"/>
-          <w:sz w:val="21"/>
-        </w:rPr>
-        <w:t xml:space="preserve">Прелаз: </w:t>
-      </w:r>
-      <w:r>
-        <w:rPr>
-          <w:i/>
-          <w:color w:val="5A6370"/>
-          <w:sz w:val="21"/>
-        </w:rPr>
-        <w:t>Детаљном анализом овог кода дошла сам до пет конкретних недостатака.</w:t>
-      </w:r>
-    </w:p>
-    <w:p>
-      <w:r>
-        <w:rPr>
-          <w:color w:val="D0D4DA"/>
-          <w:sz w:val="16"/>
-        </w:rPr>
-        <w:t>──────────────────────────────────────────────────────────────────────────────────────────</w:t>
-      </w:r>
-    </w:p>
-    <w:p>
-      <w:pPr>
-        <w:spacing w:before="360" w:after="40"/>
+        <w:spacing w:before="320" w:after="40"/>
       </w:pPr>
       <w:r>
         <w:rPr>
@@ -592,7 +333,7 @@
           <w:color w:val="141E2E"/>
           <w:sz w:val="28"/>
         </w:rPr>
-        <w:t>СЛАЈД 6  —  Идентификовани недостаци</w:t>
+        <w:t>СЛАЈД 6 — Идентификовани недостаци</w:t>
       </w:r>
     </w:p>
     <w:p>
@@ -601,7 +342,6 @@
       </w:pPr>
       <w:r>
         <w:rPr>
-          <w:b/>
           <w:color w:val="2C8C82"/>
           <w:sz w:val="20"/>
         </w:rPr>
@@ -617,82 +357,72 @@
         <w:rPr>
           <w:sz w:val="23"/>
         </w:rPr>
-        <w:t>Прво, немогуће праћење захтева кроз више сервиса — не постоји ниједан trace ID. Друго, потпуно одсуство метрика перформанси — CPU, меморија, латенција, стопа грешака. Треће, „тихе” грешке — нашла сам конкретан пример у коду где се грешка ухвати, али се нигде не логује, што би оставило систем у недоследном стању без иједног трага зашто. Четврто, ниједан сервис нема health check механизам. И пето, логовање је минимално — grep кроз цео backend показао је нула позива ILogger пре овог рада.</w:t>
+        <w:t>Детаљном анализом дошла сам до пет конкретних недостатака.</w:t>
       </w:r>
     </w:p>
     <w:p>
       <w:pPr>
-        <w:spacing w:after="40"/>
+        <w:spacing w:after="120"/>
+        <w:jc w:val="both"/>
       </w:pPr>
       <w:r>
         <w:rPr>
-          <w:b/>
-          <w:color w:val="B02A2A"/>
-          <w:sz w:val="21"/>
+          <w:sz w:val="23"/>
         </w:rPr>
-        <w:t>Не заборави:</w:t>
+        <w:t>Први је немогућност праћења захтева кроз више сервиса, јер није постојао trace ID.</w:t>
       </w:r>
     </w:p>
     <w:p>
       <w:pPr>
-        <w:pStyle w:val="ListBullet"/>
-        <w:spacing w:after="40"/>
+        <w:spacing w:after="120"/>
+        <w:jc w:val="both"/>
       </w:pPr>
       <w:r>
         <w:rPr>
-          <w:color w:val="5A6370"/>
-          <w:sz w:val="21"/>
+          <w:sz w:val="23"/>
         </w:rPr>
-        <w:t>Ово су НАЈВАЖНИЈИ слајд за целу причу рада — комисија ће памтити ову листу.</w:t>
+        <w:t>Други је одсуство метрика перформанси, као што су CPU, меморија, латенција и стопа грешака.</w:t>
       </w:r>
     </w:p>
     <w:p>
       <w:pPr>
-        <w:pStyle w:val="ListBullet"/>
-        <w:spacing w:after="40"/>
+        <w:spacing w:after="120"/>
+        <w:jc w:val="both"/>
       </w:pPr>
       <w:r>
         <w:rPr>
-          <w:color w:val="5A6370"/>
-          <w:sz w:val="21"/>
+          <w:sz w:val="23"/>
         </w:rPr>
-        <w:t>Ако имаш времена, једном реченицом опиши тихи catch блок (AuthService/TripClient) — то је конкретан доказ да ниси само нагађала.</w:t>
+        <w:t>Трећи су „тихе“ грешке. Пронађен је конкретан пример у коду где се грешка ухвати, али се нигде не логује, па не остаје траг о томе шта се догодило.</w:t>
       </w:r>
     </w:p>
     <w:p>
       <w:pPr>
-        <w:spacing w:after="80"/>
+        <w:spacing w:after="120"/>
+        <w:jc w:val="both"/>
       </w:pPr>
       <w:r>
         <w:rPr>
-          <w:b/>
-          <w:i/>
-          <w:color w:val="2C8C82"/>
-          <w:sz w:val="21"/>
+          <w:sz w:val="23"/>
         </w:rPr>
-        <w:t xml:space="preserve">Прелаз: </w:t>
-      </w:r>
-      <w:r>
-        <w:rPr>
-          <w:i/>
-          <w:color w:val="5A6370"/>
-          <w:sz w:val="21"/>
-        </w:rPr>
-        <w:t>На основу ове пет тачака, дизајнирала сам решење засновано на једном заједничком стандарду.</w:t>
-      </w:r>
-    </w:p>
-    <w:p>
-      <w:r>
-        <w:rPr>
-          <w:color w:val="D0D4DA"/>
-          <w:sz w:val="16"/>
-        </w:rPr>
-        <w:t>──────────────────────────────────────────────────────────────────────────────────────────</w:t>
+        <w:t>Четврти недостатак је то што сервиси нису имали health check механизам.</w:t>
       </w:r>
     </w:p>
     <w:p>
       <w:pPr>
-        <w:spacing w:before="360" w:after="40"/>
+        <w:spacing w:after="120"/>
+        <w:jc w:val="both"/>
+      </w:pPr>
+      <w:r>
+        <w:rPr>
+          <w:sz w:val="23"/>
+        </w:rPr>
+        <w:t>И пети је минимално логовање — претрагом backend кода нисам пронашла ниједан позив ILogger пре ове надоградње.</w:t>
+      </w:r>
+    </w:p>
+    <w:p>
+      <w:pPr>
+        <w:spacing w:before="320" w:after="40"/>
       </w:pPr>
       <w:r>
         <w:rPr>
@@ -700,7 +430,7 @@
           <w:color w:val="141E2E"/>
           <w:sz w:val="28"/>
         </w:rPr>
-        <w:t>СЛАЈД 7  —  OpenTelemetry + Grafana stack</w:t>
+        <w:t>СЛАЈД 7 — OpenTelemetry + Grafana stack</w:t>
       </w:r>
     </w:p>
     <w:p>
@@ -709,7 +439,6 @@
       </w:pPr>
       <w:r>
         <w:rPr>
-          <w:b/>
           <w:color w:val="2C8C82"/>
           <w:sz w:val="20"/>
         </w:rPr>
@@ -725,82 +454,36 @@
         <w:rPr>
           <w:sz w:val="23"/>
         </w:rPr>
-        <w:t>Уместо низа појединачних закрпа, изабрала сам OpenTelemetry као централни, vendor-неутралан стандард који обједињује traces, metrics и logs под једним API-јем, са готовом инструментацијом за ASP.NET Core, HttpClient и SqlClient. Сервиси шаљу телеметрију ка OpenTelemetry Collector-у, који је даље усмерава: Prometheus за метрике, Grafana Tempo за дистрибуирано праћење захтева, Grafana Loki за логове. Grafana је јединствен визуелни слој за све то, са унакрсном навигацијом — из лога директно на trace, из trace-a директно на метрику.</w:t>
+        <w:t>Уместо да сваки од ових проблема решавам засебно, изабрала сам OpenTelemetry као централни, vendor-неутралан стандард за traces, metrics и logs.</w:t>
       </w:r>
     </w:p>
     <w:p>
       <w:pPr>
-        <w:spacing w:after="40"/>
+        <w:spacing w:after="120"/>
+        <w:jc w:val="both"/>
       </w:pPr>
       <w:r>
         <w:rPr>
-          <w:b/>
-          <w:color w:val="B02A2A"/>
-          <w:sz w:val="21"/>
+          <w:sz w:val="23"/>
         </w:rPr>
-        <w:t>Не заборави:</w:t>
+        <w:t>OpenTelemetry има готову инструментацију за ASP.NET Core, HttpClient и SqlClient. Сервиси шаљу телеметрију ка OpenTelemetry Collector-у, који је даље усмерава ка Prometheus-у за метрике, Grafana Tempo-у за дистрибуирано праћење захтева и Grafana Loki-ју за логове.</w:t>
       </w:r>
     </w:p>
     <w:p>
       <w:pPr>
-        <w:pStyle w:val="ListBullet"/>
-        <w:spacing w:after="40"/>
+        <w:spacing w:after="120"/>
+        <w:jc w:val="both"/>
       </w:pPr>
       <w:r>
         <w:rPr>
-          <w:color w:val="5A6370"/>
-          <w:sz w:val="21"/>
+          <w:sz w:val="23"/>
         </w:rPr>
-        <w:t>Ово је технички најгушћи слајд — успори темпо овде.</w:t>
+        <w:t>Grafana служи као јединствени визуелни слој, са могућношћу да се из лога пређе директно на trace, а из trace-а на метрику.</w:t>
       </w:r>
     </w:p>
     <w:p>
       <w:pPr>
-        <w:pStyle w:val="ListBullet"/>
-        <w:spacing w:after="40"/>
-      </w:pPr>
-      <w:r>
-        <w:rPr>
-          <w:color w:val="5A6370"/>
-          <w:sz w:val="21"/>
-        </w:rPr>
-        <w:t>Ако те питају „зашто баш OpenTelemetry а не нпр. Application Insights” — одговор је vendor lock-in, то пише и у раду.</w:t>
-      </w:r>
-    </w:p>
-    <w:p>
-      <w:pPr>
-        <w:spacing w:after="80"/>
-      </w:pPr>
-      <w:r>
-        <w:rPr>
-          <w:b/>
-          <w:i/>
-          <w:color w:val="2C8C82"/>
-          <w:sz w:val="21"/>
-        </w:rPr>
-        <w:t xml:space="preserve">Прелаз: </w:t>
-      </w:r>
-      <w:r>
-        <w:rPr>
-          <w:i/>
-          <w:color w:val="5A6370"/>
-          <w:sz w:val="21"/>
-        </w:rPr>
-        <w:t>Хајде да видимо како то изгледа кад се дода тај observability слој изнад постојеће архитектуре.</w:t>
-      </w:r>
-    </w:p>
-    <w:p>
-      <w:r>
-        <w:rPr>
-          <w:color w:val="D0D4DA"/>
-          <w:sz w:val="16"/>
-        </w:rPr>
-        <w:t>──────────────────────────────────────────────────────────────────────────────────────────</w:t>
-      </w:r>
-    </w:p>
-    <w:p>
-      <w:pPr>
-        <w:spacing w:before="360" w:after="40"/>
+        <w:spacing w:before="320" w:after="40"/>
       </w:pPr>
       <w:r>
         <w:rPr>
@@ -808,7 +491,7 @@
           <w:color w:val="141E2E"/>
           <w:sz w:val="28"/>
         </w:rPr>
-        <w:t>СЛАЈД 8  —  TO-BE архитектура</w:t>
+        <w:t>СЛАЈД 8 — TO-BE архитектура</w:t>
       </w:r>
     </w:p>
     <w:p>
@@ -817,7 +500,6 @@
       </w:pPr>
       <w:r>
         <w:rPr>
-          <w:b/>
           <w:color w:val="2C8C82"/>
           <w:sz w:val="20"/>
         </w:rPr>
@@ -833,82 +515,36 @@
         <w:rPr>
           <w:sz w:val="23"/>
         </w:rPr>
-        <w:t>Ово је циљна архитектура након надоградње. Разлика у односу на претходни дијаграм је управо тај додати observability слој доле лево — Collector, Prometheus, Tempo, Loki и Grafana, који ради кроз Docker Compose, потпуно независно од постојећег Service Fabric кластера. Ниједан сервис није измењен по питању пословне логике — само је додата инструментација.</w:t>
+        <w:t>Ово је циљна архитектура након надоградње. У односу на претходни дијаграм, додат је observability слој који чине Collector, Prometheus, Tempo, Loki и Grafana.</w:t>
       </w:r>
     </w:p>
     <w:p>
       <w:pPr>
-        <w:spacing w:after="40"/>
+        <w:spacing w:after="120"/>
+        <w:jc w:val="both"/>
       </w:pPr>
       <w:r>
         <w:rPr>
-          <w:b/>
-          <w:color w:val="B02A2A"/>
-          <w:sz w:val="21"/>
+          <w:sz w:val="23"/>
         </w:rPr>
-        <w:t>Не заборави:</w:t>
+        <w:t>Тај слој ради кроз Docker Compose и независан је од постојећег Service Fabric кластера. На тај начин није било потребно мењати постојећу пословну логику — додата је само инструментација.</w:t>
       </w:r>
     </w:p>
     <w:p>
       <w:pPr>
-        <w:pStyle w:val="ListBullet"/>
-        <w:spacing w:after="40"/>
+        <w:spacing w:after="120"/>
+        <w:jc w:val="both"/>
       </w:pPr>
       <w:r>
         <w:rPr>
-          <w:color w:val="5A6370"/>
-          <w:sz w:val="21"/>
+          <w:sz w:val="23"/>
         </w:rPr>
-        <w:t>Нагласи: „независно од Service Fabric-a” — то показује да ниси ризиковала постојећи систем.</w:t>
+        <w:t>Такође, за пропагацију контекста није било потребно писати custom код.</w:t>
       </w:r>
     </w:p>
     <w:p>
       <w:pPr>
-        <w:pStyle w:val="ListBullet"/>
-        <w:spacing w:after="40"/>
-      </w:pPr>
-      <w:r>
-        <w:rPr>
-          <w:color w:val="5A6370"/>
-          <w:sz w:val="21"/>
-        </w:rPr>
-        <w:t>„Ниједна линија custom кода за пропагацију контекста” је реченица коју волим да поновим овде ако има времена.</w:t>
-      </w:r>
-    </w:p>
-    <w:p>
-      <w:pPr>
-        <w:spacing w:after="80"/>
-      </w:pPr>
-      <w:r>
-        <w:rPr>
-          <w:b/>
-          <w:i/>
-          <w:color w:val="2C8C82"/>
-          <w:sz w:val="21"/>
-        </w:rPr>
-        <w:t xml:space="preserve">Прелаз: </w:t>
-      </w:r>
-      <w:r>
-        <w:rPr>
-          <w:i/>
-          <w:color w:val="5A6370"/>
-          <w:sz w:val="21"/>
-        </w:rPr>
-        <w:t>Прва конкретна компонента коју сам имплементирала су health checks — ево како то изгледа.</w:t>
-      </w:r>
-    </w:p>
-    <w:p>
-      <w:r>
-        <w:rPr>
-          <w:color w:val="D0D4DA"/>
-          <w:sz w:val="16"/>
-        </w:rPr>
-        <w:t>──────────────────────────────────────────────────────────────────────────────────────────</w:t>
-      </w:r>
-    </w:p>
-    <w:p>
-      <w:pPr>
-        <w:spacing w:before="360" w:after="40"/>
+        <w:spacing w:before="320" w:after="40"/>
       </w:pPr>
       <w:r>
         <w:rPr>
@@ -916,7 +552,7 @@
           <w:color w:val="141E2E"/>
           <w:sz w:val="28"/>
         </w:rPr>
-        <w:t>СЛАЈД 9  —  Health checks</w:t>
+        <w:t>СЛАЈД 9 — Health checks</w:t>
       </w:r>
     </w:p>
     <w:p>
@@ -925,7 +561,6 @@
       </w:pPr>
       <w:r>
         <w:rPr>
-          <w:b/>
           <w:color w:val="2C8C82"/>
           <w:sz w:val="20"/>
         </w:rPr>
@@ -941,69 +576,48 @@
         <w:rPr>
           <w:sz w:val="23"/>
         </w:rPr>
-        <w:t>Сваки сервис сада излаже два endpoint-а: /health/live, који каже да ли процес уопште живи, и /health/ready, који проверава да ли су критичне зависности спремне — на пример, да ли је SQL база доступна. Gateway нема сопствену базу, па он проверава мрежну доступност три downstream сервиса, преко истих адреса које већ користи YARP за рутирање, без дуплирања конфигурације. Одговор је структурисан JSON, овде видите пример где су сва три сервиса Healthy.</w:t>
+        <w:t>Сваки сервис сада излаже два endpoint-а: /health/live и /health/ready.</w:t>
       </w:r>
     </w:p>
     <w:p>
       <w:pPr>
-        <w:spacing w:after="40"/>
+        <w:spacing w:after="120"/>
+        <w:jc w:val="both"/>
       </w:pPr>
       <w:r>
         <w:rPr>
-          <w:b/>
-          <w:color w:val="B02A2A"/>
-          <w:sz w:val="21"/>
+          <w:sz w:val="23"/>
         </w:rPr>
-        <w:t>Не заборави:</w:t>
+        <w:t>Live endpoint показује да ли процес уопште ради, док ready endpoint проверава да ли су критичне зависности спремне, на пример да ли је SQL база доступна.</w:t>
       </w:r>
     </w:p>
     <w:p>
       <w:pPr>
-        <w:pStyle w:val="ListBullet"/>
-        <w:spacing w:after="40"/>
+        <w:spacing w:after="120"/>
+        <w:jc w:val="both"/>
       </w:pPr>
       <w:r>
         <w:rPr>
-          <w:color w:val="5A6370"/>
-          <w:sz w:val="21"/>
+          <w:sz w:val="23"/>
         </w:rPr>
-        <w:t>Ако питају разлику live/ready — live=процес жив, ready=зависности спремне (Kubernetes-style конвенција).</w:t>
+        <w:t>Gateway нема сопствену базу, па он проверава доступност три downstream сервиса, користећи исте адресе које већ користи YARP за рутирање.</w:t>
       </w:r>
     </w:p>
     <w:p>
       <w:pPr>
-        <w:spacing w:after="80"/>
+        <w:spacing w:after="120"/>
+        <w:jc w:val="both"/>
       </w:pPr>
       <w:r>
         <w:rPr>
-          <w:b/>
-          <w:i/>
-          <w:color w:val="2C8C82"/>
-          <w:sz w:val="21"/>
+          <w:sz w:val="23"/>
         </w:rPr>
-        <w:t xml:space="preserve">Прелаз: </w:t>
-      </w:r>
-      <w:r>
-        <w:rPr>
-          <w:i/>
-          <w:color w:val="5A6370"/>
-          <w:sz w:val="21"/>
-        </w:rPr>
-        <w:t>Health checks су само један део — целу слику добијате тек кад погледате dashboard.</w:t>
-      </w:r>
-    </w:p>
-    <w:p>
-      <w:r>
-        <w:rPr>
-          <w:color w:val="D0D4DA"/>
-          <w:sz w:val="16"/>
-        </w:rPr>
-        <w:t>──────────────────────────────────────────────────────────────────────────────────────────</w:t>
+        <w:t>Одговор је структуриран у JSON формату, а на примеру се види стање у ком су сва три сервиса Healthy.</w:t>
       </w:r>
     </w:p>
     <w:p>
       <w:pPr>
-        <w:spacing w:before="360" w:after="40"/>
+        <w:spacing w:before="320" w:after="40"/>
       </w:pPr>
       <w:r>
         <w:rPr>
@@ -1011,7 +625,7 @@
           <w:color w:val="141E2E"/>
           <w:sz w:val="28"/>
         </w:rPr>
-        <w:t>СЛАЈД 10  —  Grafana dashboard — све на једном месту</w:t>
+        <w:t>СЛАЈД 10 — Grafana dashboard — све на једном месту</w:t>
       </w:r>
     </w:p>
     <w:p>
@@ -1020,7 +634,6 @@
       </w:pPr>
       <w:r>
         <w:rPr>
-          <w:b/>
           <w:color w:val="2C8C82"/>
           <w:sz w:val="20"/>
         </w:rPr>
@@ -1036,69 +649,36 @@
         <w:rPr>
           <w:sz w:val="23"/>
         </w:rPr>
-        <w:t>Овај provisioned dashboard приказује RED метрике — request rate, error rate, p95 latency — ресурсе попут CPU-а, меморије и garbage collector-а, и ток логова, све филтрирано по сервису преко template варијабле. Ово директно решава недостатак број два и пет са листе — сада имамо потпун увид у перформансе без иједног ручног прегледа конзоле.</w:t>
+        <w:t>Овај dashboard приказује RED метрике — request rate, error rate и p95 latency — као и ресурсе попут CPU-а, меморије и garbage collector-а.</w:t>
       </w:r>
     </w:p>
     <w:p>
       <w:pPr>
-        <w:spacing w:after="40"/>
+        <w:spacing w:after="120"/>
+        <w:jc w:val="both"/>
       </w:pPr>
       <w:r>
         <w:rPr>
-          <w:b/>
-          <w:color w:val="B02A2A"/>
-          <w:sz w:val="21"/>
+          <w:sz w:val="23"/>
         </w:rPr>
-        <w:t>Не заборави:</w:t>
+        <w:t>Ту је и ток логова, који може да се филтрира по сервису.</w:t>
       </w:r>
     </w:p>
     <w:p>
       <w:pPr>
-        <w:pStyle w:val="ListBullet"/>
-        <w:spacing w:after="40"/>
+        <w:spacing w:after="120"/>
+        <w:jc w:val="both"/>
       </w:pPr>
       <w:r>
         <w:rPr>
-          <w:color w:val="5A6370"/>
-          <w:sz w:val="21"/>
+          <w:sz w:val="23"/>
         </w:rPr>
-        <w:t>Не мораш да објашњаваш сваки график понаособ — довољно је „RED метрике + ресурси, филтрирано по сервису”.</w:t>
+        <w:t>На овај начин су решени недостаци везани за праћење перформанси и логовање, јер више није потребно ручно прегледати конзолу да би се добила слика о стању система.</w:t>
       </w:r>
     </w:p>
     <w:p>
       <w:pPr>
-        <w:spacing w:after="80"/>
-      </w:pPr>
-      <w:r>
-        <w:rPr>
-          <w:b/>
-          <w:i/>
-          <w:color w:val="2C8C82"/>
-          <w:sz w:val="21"/>
-        </w:rPr>
-        <w:t xml:space="preserve">Прелаз: </w:t>
-      </w:r>
-      <w:r>
-        <w:rPr>
-          <w:i/>
-          <w:color w:val="5A6370"/>
-          <w:sz w:val="21"/>
-        </w:rPr>
-        <w:t>Наравно, dashboard без тестова није доказ — зато прелазим на тестирање.</w:t>
-      </w:r>
-    </w:p>
-    <w:p>
-      <w:r>
-        <w:rPr>
-          <w:color w:val="D0D4DA"/>
-          <w:sz w:val="16"/>
-        </w:rPr>
-        <w:t>──────────────────────────────────────────────────────────────────────────────────────────</w:t>
-      </w:r>
-    </w:p>
-    <w:p>
-      <w:pPr>
-        <w:spacing w:before="360" w:after="40"/>
+        <w:spacing w:before="320" w:after="40"/>
       </w:pPr>
       <w:r>
         <w:rPr>
@@ -1106,7 +686,7 @@
           <w:color w:val="141E2E"/>
           <w:sz w:val="28"/>
         </w:rPr>
-        <w:t>СЛАЈД 11  —  Тестирање — стратегија</w:t>
+        <w:t>СЛАЈД 11 — Тестирање — стратегија</w:t>
       </w:r>
     </w:p>
     <w:p>
@@ -1115,7 +695,6 @@
       </w:pPr>
       <w:r>
         <w:rPr>
-          <w:b/>
           <w:color w:val="2C8C82"/>
           <w:sz w:val="20"/>
         </w:rPr>
@@ -1131,82 +710,48 @@
         <w:rPr>
           <w:sz w:val="23"/>
         </w:rPr>
-        <w:t>Направила сам четири xUnit пројекта, по један за сваки сервис, где сваки тест подиже прав Kestrel host на ефемерном порту, без mock-а базе података. HealthEndpointsTests тестирају health check endpoint-e интеграционо. ObservabilityPipelineTests проверавају да ли се OTel инструментација исправно активира — ту сам, узгред, открила стваран детаљ везан за тренутак када се име руте обогаћује. И TripClientTests су регресиони тест управо за онај „тихи” catch блок који сам поменула раније. Укупно, свих 21 тест пролази.</w:t>
+        <w:t>Да dashboard не би био само визуелни доказ, урађено је и аутоматизовано тестирање.</w:t>
       </w:r>
     </w:p>
     <w:p>
       <w:pPr>
-        <w:spacing w:after="40"/>
+        <w:spacing w:after="120"/>
+        <w:jc w:val="both"/>
       </w:pPr>
       <w:r>
         <w:rPr>
-          <w:b/>
-          <w:color w:val="B02A2A"/>
-          <w:sz w:val="21"/>
+          <w:sz w:val="23"/>
         </w:rPr>
-        <w:t>Не заборави:</w:t>
+        <w:t>Направљена су четири xUnit пројекта, по један за сваки сервис. Сваки тест подиже прави Kestrel host на ефемерном порту, без mock-а базе података.</w:t>
       </w:r>
     </w:p>
     <w:p>
       <w:pPr>
-        <w:pStyle w:val="ListBullet"/>
-        <w:spacing w:after="40"/>
+        <w:spacing w:after="120"/>
+        <w:jc w:val="both"/>
       </w:pPr>
       <w:r>
         <w:rPr>
-          <w:color w:val="5A6370"/>
-          <w:sz w:val="21"/>
+          <w:sz w:val="23"/>
         </w:rPr>
-        <w:t>Ако имаш времена, спомени ObservabilityPipelineTests налаз — то показује дубину анализе, не само писање тестова.</w:t>
+        <w:t>HealthEndpointsTests проверавају health check endpoint-е, ObservabilityPipelineTests проверавају да ли се OTel инструментација исправно активира, а TripClientTests покривају понашање везано за „тихи“ catch блок.</w:t>
       </w:r>
     </w:p>
     <w:p>
       <w:pPr>
-        <w:pStyle w:val="ListBullet"/>
-        <w:spacing w:after="40"/>
+        <w:spacing w:after="120"/>
+        <w:jc w:val="both"/>
       </w:pPr>
       <w:r>
         <w:rPr>
-          <w:color w:val="5A6370"/>
-          <w:sz w:val="21"/>
+          <w:sz w:val="23"/>
         </w:rPr>
-        <w:t>21/21 — упамти тај број, враћа се неколико пута.</w:t>
+        <w:t>Укупно, свих 21 тест пролази.</w:t>
       </w:r>
     </w:p>
     <w:p>
       <w:pPr>
-        <w:spacing w:after="80"/>
-      </w:pPr>
-      <w:r>
-        <w:rPr>
-          <w:b/>
-          <w:i/>
-          <w:color w:val="2C8C82"/>
-          <w:sz w:val="21"/>
-        </w:rPr>
-        <w:t xml:space="preserve">Прелаз: </w:t>
-      </w:r>
-      <w:r>
-        <w:rPr>
-          <w:i/>
-          <w:color w:val="5A6370"/>
-          <w:sz w:val="21"/>
-        </w:rPr>
-        <w:t>Али 21 тест који пролази није довољан доказ да тестови нешто ЗАИСТА проверавају — зато сам урадила и ово.</w:t>
-      </w:r>
-    </w:p>
-    <w:p>
-      <w:r>
-        <w:rPr>
-          <w:color w:val="D0D4DA"/>
-          <w:sz w:val="16"/>
-        </w:rPr>
-        <w:t>──────────────────────────────────────────────────────────────────────────────────────────</w:t>
-      </w:r>
-    </w:p>
-    <w:p>
-      <w:pPr>
-        <w:spacing w:before="360" w:after="40"/>
+        <w:spacing w:before="320" w:after="40"/>
       </w:pPr>
       <w:r>
         <w:rPr>
@@ -1214,7 +759,7 @@
           <w:color w:val="141E2E"/>
           <w:sz w:val="28"/>
         </w:rPr>
-        <w:t>СЛАЈД 12  —  Доказ да тестови стварно нешто проверавају</w:t>
+        <w:t>СЛАЈД 12 — Доказ да тестови стварно нешто проверавају</w:t>
       </w:r>
     </w:p>
     <w:p>
@@ -1223,7 +768,6 @@
       </w:pPr>
       <w:r>
         <w:rPr>
-          <w:b/>
           <w:color w:val="2C8C82"/>
           <w:sz w:val="20"/>
         </w:rPr>
@@ -1239,69 +783,36 @@
         <w:rPr>
           <w:sz w:val="23"/>
         </w:rPr>
-        <w:t>Да бих показала да тестови нису тек формалност, намерно сам привремено вратила оригинални „тихи” catch блок — уклонила сам само један позив LogWarning-a. Резултат: тачно један тест пада, управо онај који проверава да неуспешан HTTP статус производи тај лог, а преостала два теста из истог пројекта остају непромењена и даље пролазе. Након што сам вратила исправку, сви тестови су поново прошли.</w:t>
+        <w:t>Да бих показала да тестови нису само формалност, намерно сам привремено вратила оригинални „тихи“ catch блок, односно уклонила сам само један позив LogWarning-а.</w:t>
       </w:r>
     </w:p>
     <w:p>
       <w:pPr>
-        <w:spacing w:after="40"/>
+        <w:spacing w:after="120"/>
+        <w:jc w:val="both"/>
       </w:pPr>
       <w:r>
         <w:rPr>
-          <w:b/>
-          <w:color w:val="B02A2A"/>
-          <w:sz w:val="21"/>
+          <w:sz w:val="23"/>
         </w:rPr>
-        <w:t>Не заборави:</w:t>
+        <w:t>Резултат је био да тачно један тест падне — управо онај који проверава да неуспешан HTTP статус производи одговарајући лог. Остала два теста из истог пројекта су и даље пролазила.</w:t>
       </w:r>
     </w:p>
     <w:p>
       <w:pPr>
-        <w:pStyle w:val="ListBullet"/>
-        <w:spacing w:after="40"/>
+        <w:spacing w:after="120"/>
+        <w:jc w:val="both"/>
       </w:pPr>
       <w:r>
         <w:rPr>
-          <w:color w:val="5A6370"/>
-          <w:sz w:val="21"/>
+          <w:sz w:val="23"/>
         </w:rPr>
-        <w:t>Ово је „aha” тренутак презентације — говори то помало поносно, ово је твоја идеја да докажеш квалитет тестова.</w:t>
+        <w:t>Након враћања исправке, сви тестови су поново прошли.</w:t>
       </w:r>
     </w:p>
     <w:p>
       <w:pPr>
-        <w:spacing w:after="80"/>
-      </w:pPr>
-      <w:r>
-        <w:rPr>
-          <w:b/>
-          <w:i/>
-          <w:color w:val="2C8C82"/>
-          <w:sz w:val="21"/>
-        </w:rPr>
-        <w:t xml:space="preserve">Прелаз: </w:t>
-      </w:r>
-      <w:r>
-        <w:rPr>
-          <w:i/>
-          <w:color w:val="5A6370"/>
-          <w:sz w:val="21"/>
-        </w:rPr>
-        <w:t>Осим формалних тестова, урадила сам и четири демонстрациона сценарија над стварним, живим системом.</w:t>
-      </w:r>
-    </w:p>
-    <w:p>
-      <w:r>
-        <w:rPr>
-          <w:color w:val="D0D4DA"/>
-          <w:sz w:val="16"/>
-        </w:rPr>
-        <w:t>──────────────────────────────────────────────────────────────────────────────────────────</w:t>
-      </w:r>
-    </w:p>
-    <w:p>
-      <w:pPr>
-        <w:spacing w:before="360" w:after="40"/>
+        <w:spacing w:before="320" w:after="40"/>
       </w:pPr>
       <w:r>
         <w:rPr>
@@ -1309,7 +820,7 @@
           <w:color w:val="141E2E"/>
           <w:sz w:val="28"/>
         </w:rPr>
-        <w:t>СЛАЈД 13  —  Демонстрациони сценарији над стварним системом</w:t>
+        <w:t>СЛАЈД 13 — Демонстрациони сценарији над стварним системом</w:t>
       </w:r>
     </w:p>
     <w:p>
@@ -1318,7 +829,6 @@
       </w:pPr>
       <w:r>
         <w:rPr>
-          <w:b/>
           <w:color w:val="2C8C82"/>
           <w:sz w:val="20"/>
         </w:rPr>
@@ -1334,82 +844,60 @@
         <w:rPr>
           <w:sz w:val="23"/>
         </w:rPr>
-        <w:t>Сва четири сценарија извршена су над стварно постављеним системом, не симулирано. Сценарио 1 — нормалан захтев кроз три сервиса, где trace показује чак девет угнежђених SQL child span-ова. Сценарио 2 — намерно сам угасила TripService, а health check је аутоматски пријавио Unhealthy статус, систем се сам опоравио за седам секунди. Сценарио 3 — k6 load test са 780 захтева, где се клијентска и серверска латенција поклапају готово идентично, 2.12 наспрам 2.14 секунде, што доказује да метрике стварно одражавају понашање система. Сценарио 4 — намерно успорена SQL зависност, где trace тачно локализује да је узрок конкретна UPDATE наредба, не захтев уопштено.</w:t>
+        <w:t>Поред аутоматизованих тестова, урадила сам и четири демонстрациона сценарија над стварно постављеним системом.</w:t>
       </w:r>
     </w:p>
     <w:p>
       <w:pPr>
-        <w:spacing w:after="40"/>
+        <w:spacing w:after="120"/>
+        <w:jc w:val="both"/>
       </w:pPr>
       <w:r>
         <w:rPr>
-          <w:b/>
-          <w:color w:val="B02A2A"/>
-          <w:sz w:val="21"/>
+          <w:sz w:val="23"/>
         </w:rPr>
-        <w:t>Не заборави:</w:t>
+        <w:t>У првом сценарију нормалан захтев пролази кроз три сервиса, а trace приказује чак девет угнежђених SQL child span-ова.</w:t>
       </w:r>
     </w:p>
     <w:p>
       <w:pPr>
-        <w:pStyle w:val="ListBullet"/>
-        <w:spacing w:after="40"/>
+        <w:spacing w:after="120"/>
+        <w:jc w:val="both"/>
       </w:pPr>
       <w:r>
         <w:rPr>
-          <w:color w:val="5A6370"/>
-          <w:sz w:val="21"/>
+          <w:sz w:val="23"/>
         </w:rPr>
-        <w:t>Ово је најдужи слајд — ако касниш са временом, скрати сценарио 2 и 3 на по једну реченицу.</w:t>
+        <w:t>У другом сценарију намерно је угашен TripService. Health check је аутоматски пријавио Unhealthy статус, а систем се опоравио за око седам секунди.</w:t>
       </w:r>
     </w:p>
     <w:p>
       <w:pPr>
-        <w:pStyle w:val="ListBullet"/>
-        <w:spacing w:after="40"/>
+        <w:spacing w:after="120"/>
+        <w:jc w:val="both"/>
       </w:pPr>
       <w:r>
         <w:rPr>
-          <w:color w:val="5A6370"/>
-          <w:sz w:val="21"/>
+          <w:sz w:val="23"/>
         </w:rPr>
-        <w:t>Бројеви 2.12s / 2.14s и 23.9s / 14.5ms су конкретни докази — изговори их прецизно.</w:t>
+        <w:t>Трећи сценарио је k6 load test са 780 захтева. Клијентска и серверска латенција су биле 2.12 и 2.14 секунди.</w:t>
       </w:r>
     </w:p>
     <w:p>
       <w:pPr>
-        <w:spacing w:after="80"/>
+        <w:spacing w:after="120"/>
+        <w:jc w:val="both"/>
       </w:pPr>
       <w:r>
         <w:rPr>
-          <w:b/>
-          <w:i/>
-          <w:color w:val="2C8C82"/>
-          <w:sz w:val="21"/>
+          <w:sz w:val="23"/>
         </w:rPr>
-        <w:t xml:space="preserve">Прелаз: </w:t>
-      </w:r>
-      <w:r>
-        <w:rPr>
-          <w:i/>
-          <w:color w:val="5A6370"/>
-          <w:sz w:val="21"/>
-        </w:rPr>
-        <w:t>Ево како тачно изгледа тај trace из сценарија 1, визуелно.</w:t>
-      </w:r>
-    </w:p>
-    <w:p>
-      <w:r>
-        <w:rPr>
-          <w:color w:val="D0D4DA"/>
-          <w:sz w:val="16"/>
-        </w:rPr>
-        <w:t>──────────────────────────────────────────────────────────────────────────────────────────</w:t>
+        <w:t>У четвртом сценарију намерно је успорена SQL зависност. Trace је омогућио да се узрок локализује на конкретну UPDATE наредбу, уместо да се само види да је цео захтев спор.</w:t>
       </w:r>
     </w:p>
     <w:p>
       <w:pPr>
-        <w:spacing w:before="360" w:after="40"/>
+        <w:spacing w:before="320" w:after="40"/>
       </w:pPr>
       <w:r>
         <w:rPr>
@@ -1417,7 +905,7 @@
           <w:color w:val="141E2E"/>
           <w:sz w:val="28"/>
         </w:rPr>
-        <w:t>СЛАЈД 14  —  Дистрибуирано праћење захтева у пракси</w:t>
+        <w:t>СЛАЈД 14 — Дистрибуирано праћење захтева у пракси</w:t>
       </w:r>
     </w:p>
     <w:p>
@@ -1426,7 +914,6 @@
       </w:pPr>
       <w:r>
         <w:rPr>
-          <w:b/>
           <w:color w:val="2C8C82"/>
           <w:sz w:val="20"/>
         </w:rPr>
@@ -1442,69 +929,36 @@
         <w:rPr>
           <w:sz w:val="23"/>
         </w:rPr>
-        <w:t>Овде видите стваран trace из Grafana Tempo-а за сценарио један: захтев иде Gateway, па SharingService, па TripService, и све то се дешава аутоматски, без иједне линије custom кода написане за пропагацију контекста — то долази бесплатно из OpenTelemetry-јеве ASP.NET Core и HttpClient инструментације.</w:t>
+        <w:t>Овде је приказан стварни trace из Grafana Tempo-а за први сценарио.</w:t>
       </w:r>
     </w:p>
     <w:p>
       <w:pPr>
-        <w:spacing w:after="40"/>
+        <w:spacing w:after="120"/>
+        <w:jc w:val="both"/>
       </w:pPr>
       <w:r>
         <w:rPr>
-          <w:b/>
-          <w:color w:val="B02A2A"/>
-          <w:sz w:val="21"/>
+          <w:sz w:val="23"/>
         </w:rPr>
-        <w:t>Не заборави:</w:t>
+        <w:t>Видимо како захтев иде од Gateway-а, преко SharingService-а, до TripService-а, као и угнежђене SQL операције.</w:t>
       </w:r>
     </w:p>
     <w:p>
       <w:pPr>
-        <w:pStyle w:val="ListBullet"/>
-        <w:spacing w:after="40"/>
+        <w:spacing w:after="120"/>
+        <w:jc w:val="both"/>
       </w:pPr>
       <w:r>
         <w:rPr>
-          <w:color w:val="5A6370"/>
-          <w:sz w:val="21"/>
+          <w:sz w:val="23"/>
         </w:rPr>
-        <w:t>Покажи руком водопад-дијаграм лево на десно ако презентујеш уживо.</w:t>
+        <w:t>Све ово се дешава аутоматски, без custom кода који би био написан посебно за пропагацију контекста, захваљујући OpenTelemetry инструментацији за ASP.NET Core и HttpClient.</w:t>
       </w:r>
     </w:p>
     <w:p>
       <w:pPr>
-        <w:spacing w:after="80"/>
-      </w:pPr>
-      <w:r>
-        <w:rPr>
-          <w:b/>
-          <w:i/>
-          <w:color w:val="2C8C82"/>
-          <w:sz w:val="21"/>
-        </w:rPr>
-        <w:t xml:space="preserve">Прелаз: </w:t>
-      </w:r>
-      <w:r>
-        <w:rPr>
-          <w:i/>
-          <w:color w:val="5A6370"/>
-          <w:sz w:val="21"/>
-        </w:rPr>
-        <w:t>Ово ме доводи до закључка целог рада.</w:t>
-      </w:r>
-    </w:p>
-    <w:p>
-      <w:r>
-        <w:rPr>
-          <w:color w:val="D0D4DA"/>
-          <w:sz w:val="16"/>
-        </w:rPr>
-        <w:t>──────────────────────────────────────────────────────────────────────────────────────────</w:t>
-      </w:r>
-    </w:p>
-    <w:p>
-      <w:pPr>
-        <w:spacing w:before="360" w:after="40"/>
+        <w:spacing w:before="320" w:after="40"/>
       </w:pPr>
       <w:r>
         <w:rPr>
@@ -1512,7 +966,7 @@
           <w:color w:val="141E2E"/>
           <w:sz w:val="28"/>
         </w:rPr>
-        <w:t>СЛАЈД 15  —  Шта је постигнуто</w:t>
+        <w:t>СЛАЈД 15 — Шта је постигнуто</w:t>
       </w:r>
     </w:p>
     <w:p>
@@ -1521,7 +975,6 @@
       </w:pPr>
       <w:r>
         <w:rPr>
-          <w:b/>
           <w:color w:val="2C8C82"/>
           <w:sz w:val="20"/>
         </w:rPr>
@@ -1537,69 +990,60 @@
         <w:rPr>
           <w:sz w:val="23"/>
         </w:rPr>
-        <w:t>Да сумирам: идентификовала сам пет конкретних недостатака постојећег система, имплементирала сам надоградњу засновану на OpenTelemetry и Grafana stack-у без измене иједне линије пословне логике, и верификовала сам то на два независна начина — двадесет један аутоматизован тест и четири демонстрациона сценарија над стварно постављеним системом. Што се тиче праваца даљег развоја, ту видим формално alerting решење изнад постојећих dashboard-a, инструментацију frontend-a ради потпуног end-to-end trace-a, и аутоматизацију k6 load теста као дела CI/CD pipeline-a.</w:t>
+        <w:t>Да сумирам резултате.</w:t>
       </w:r>
     </w:p>
     <w:p>
       <w:pPr>
-        <w:spacing w:after="40"/>
+        <w:spacing w:after="120"/>
+        <w:jc w:val="both"/>
       </w:pPr>
       <w:r>
         <w:rPr>
-          <w:b/>
-          <w:color w:val="B02A2A"/>
-          <w:sz w:val="21"/>
+          <w:sz w:val="23"/>
         </w:rPr>
-        <w:t>Не заборави:</w:t>
+        <w:t>Идентификовано је пет конкретних недостатака постојећег система. Затим је имплементирана надоградња заснована на OpenTelemetry и Grafana stack-у, без измене пословне логике.</w:t>
       </w:r>
     </w:p>
     <w:p>
       <w:pPr>
-        <w:pStyle w:val="ListBullet"/>
-        <w:spacing w:after="40"/>
+        <w:spacing w:after="120"/>
+        <w:jc w:val="both"/>
       </w:pPr>
       <w:r>
         <w:rPr>
-          <w:color w:val="5A6370"/>
-          <w:sz w:val="21"/>
+          <w:sz w:val="23"/>
         </w:rPr>
-        <w:t>Ово затвара причу — врати се на циљ рада са слајда 4 ако желиш ефектан завршетак („и управо то сам доказала”).</w:t>
+        <w:t>Резултат је верификован на два начина: кроз 21 аутоматизован тест и кроз четири демонстрациона сценарија над стварно постављеним системом.</w:t>
       </w:r>
     </w:p>
     <w:p>
       <w:pPr>
-        <w:spacing w:after="80"/>
+        <w:spacing w:after="120"/>
+        <w:jc w:val="both"/>
       </w:pPr>
       <w:r>
         <w:rPr>
-          <w:b/>
-          <w:i/>
-          <w:color w:val="2C8C82"/>
-          <w:sz w:val="21"/>
+          <w:sz w:val="23"/>
         </w:rPr>
-        <w:t xml:space="preserve">Прелаз: </w:t>
-      </w:r>
-      <w:r>
-        <w:rPr>
-          <w:i/>
-          <w:color w:val="5A6370"/>
-          <w:sz w:val="21"/>
-        </w:rPr>
-        <w:t>Хвала на пажњи, ту сам за питања.</w:t>
-      </w:r>
-    </w:p>
-    <w:p>
-      <w:r>
-        <w:rPr>
-          <w:color w:val="D0D4DA"/>
-          <w:sz w:val="16"/>
-        </w:rPr>
-        <w:t>──────────────────────────────────────────────────────────────────────────────────────────</w:t>
+        <w:t>Као могући правци даљег развоја издвојила бих формално alerting решење, инструментацију frontend-а за потпуни end-to-end trace и аутоматизацију k6 load теста у оквиру CI/CD pipeline-а.</w:t>
       </w:r>
     </w:p>
     <w:p>
       <w:pPr>
-        <w:spacing w:before="360" w:after="40"/>
+        <w:spacing w:after="120"/>
+        <w:jc w:val="both"/>
+      </w:pPr>
+      <w:r>
+        <w:rPr>
+          <w:sz w:val="23"/>
+        </w:rPr>
+        <w:t>Тиме је испуњен основни циљ рада — да се не покаже само да су алати инсталирани, већ да надоградња заиста даје употребљив увид у понашање система.</w:t>
+      </w:r>
+    </w:p>
+    <w:p>
+      <w:pPr>
+        <w:spacing w:before="320" w:after="40"/>
       </w:pPr>
       <w:r>
         <w:rPr>
@@ -1607,7 +1051,7 @@
           <w:color w:val="141E2E"/>
           <w:sz w:val="28"/>
         </w:rPr>
-        <w:t>СЛАЈД 16  —  Хвала на пажњи / Питања</w:t>
+        <w:t>СЛАЈД 16 — Хвала на пажњи / Питања</w:t>
       </w:r>
     </w:p>
     <w:p>
@@ -1616,7 +1060,6 @@
       </w:pPr>
       <w:r>
         <w:rPr>
-          <w:b/>
           <w:color w:val="2C8C82"/>
           <w:sz w:val="20"/>
         </w:rPr>
@@ -1632,64 +1075,7 @@
         <w:rPr>
           <w:sz w:val="23"/>
         </w:rPr>
-        <w:t>Хвала на пажњи, ту сам за евентуална питања.</w:t>
-      </w:r>
-    </w:p>
-    <w:p>
-      <w:pPr>
-        <w:spacing w:after="40"/>
-      </w:pPr>
-      <w:r>
-        <w:rPr>
-          <w:b/>
-          <w:color w:val="B02A2A"/>
-          <w:sz w:val="21"/>
-        </w:rPr>
-        <w:t>Не заборави:</w:t>
-      </w:r>
-    </w:p>
-    <w:p>
-      <w:pPr>
-        <w:pStyle w:val="ListBullet"/>
-        <w:spacing w:after="40"/>
-      </w:pPr>
-      <w:r>
-        <w:rPr>
-          <w:color w:val="5A6370"/>
-          <w:sz w:val="21"/>
-        </w:rPr>
-        <w:t>Стани мирно, насмеши се, сачекај прво питање — не пуни тишину додатним причањем.</w:t>
-      </w:r>
-    </w:p>
-    <w:p>
-      <w:pPr>
-        <w:spacing w:after="80"/>
-      </w:pPr>
-      <w:r>
-        <w:rPr>
-          <w:b/>
-          <w:i/>
-          <w:color w:val="2C8C82"/>
-          <w:sz w:val="21"/>
-        </w:rPr>
-        <w:t xml:space="preserve">Прелаз: </w:t>
-      </w:r>
-      <w:r>
-        <w:rPr>
-          <w:i/>
-          <w:color w:val="5A6370"/>
-          <w:sz w:val="21"/>
-        </w:rPr>
-        <w:t>(крај излагања)</w:t>
-      </w:r>
-    </w:p>
-    <w:p>
-      <w:r>
-        <w:rPr>
-          <w:color w:val="D0D4DA"/>
-          <w:sz w:val="16"/>
-        </w:rPr>
-        <w:t>──────────────────────────────────────────────────────────────────────────────────────────</w:t>
+        <w:t>Хвала на пажњи. Ту сам за евентуална питања.</w:t>
       </w:r>
     </w:p>
     <w:sectPr>
@@ -2066,7 +1452,7 @@
     <w:qFormat/>
     <w:rsid w:val="00FC693F"/>
     <w:rPr>
-      <w:rFonts w:ascii="Calibri" w:hAnsi="Calibri" w:eastAsia="Calibri"/>
+      <w:rFonts w:ascii="Calibri" w:hAnsi="Calibri"/>
       <w:sz w:val="22"/>
     </w:rPr>
   </w:style>

</xml_diff>